<commit_message>
fix: address project economics review findings
</commit_message>
<xml_diff>
--- a/docs/modules/bsee/summary/2025-07-19_AI Article V2.docx
+++ b/docs/modules/bsee/summary/2025-07-19_AI Article V2.docx
@@ -31,7 +31,7 @@
           <w:b/>
           <w:bCs/>
         </w:rPr>
-        <w:t>Frontier Deepwater</w:t>
+        <w:t>Reference contributor</w:t>
       </w:r>
     </w:p>
     <w:p>
@@ -67,7 +67,7 @@
     </w:p>
     <w:p>
       <w:r>
-        <w:t>Frontier Deepwater has been advancing that case since 2020. With new lifecycle performance data from the BMT SLOOP model, historical cost benchmarking, and detailed comparisons from our Gulf of Mexico Drilling and Completion Performance Study (2014), and validation from third-party studies like Shell’s DDS riser and motion modeling (AC12282785), the dry tree approach is no longer a what-if. It is a viable—and in many cases, superior—option for unlocking the Lower Tertiary.</w:t>
+        <w:t>Reference contributor has been advancing that case since 2020. With new lifecycle performance data from the BMT SLOOP model, historical cost benchmarking, and detailed comparisons from our Gulf of Mexico Drilling and Completion Performance Study (2014), and validation from third-party studies like Shell’s DDS riser and motion modeling (AC12282785), the dry tree approach is no longer a what-if. It is a viable—and in many cases, superior—option for unlocking the Lower Tertiary.</w:t>
       </w:r>
     </w:p>
     <w:p>
@@ -734,7 +734,7 @@
     </w:p>
     <w:p>
       <w:r>
-        <w:t>Frontier Deepwater is leveraging real-time drilling, completion, and production data to finalize detailed field-by-field analyses, updating decline curves, completion effectiveness, intervention frequencies, and accurate financial modeling for fields like Kaskida and Shenandoah. This robust data-driven approach will empower clearer, more strategic FID decisions.</w:t>
+        <w:t>Reference contributor is leveraging real-time drilling, completion, and production data to finalize detailed field-by-field analyses, updating decline curves, completion effectiveness, intervention frequencies, and accurate financial modeling for fields like Kaskida and Shenandoah. This robust data-driven approach will empower clearer, more strategic FID decisions.</w:t>
       </w:r>
     </w:p>
     <w:p>

</xml_diff>